<commit_message>
fix: align lease clauses with rent terms
</commit_message>
<xml_diff>
--- a/docs/templates/commrent-rental-contract-template.docx
+++ b/docs/templates/commrent-rental-contract-template.docx
@@ -150,7 +150,7 @@
         <w:jc w:val="both"/>
       </w:pPr>
       <w:r>
-        <w:t>2.2. По истечении срока Договора при отсутствии письменных возражений ни одной из Сторон, направленных другой Стороне не позднее чем за 30 (тридцать) календарных дней до даты окончания, Договор считается продлённым на тех же условиях на новый срок 1 (один) год. Количество таких пролонгаций не ограничено.</w:t>
+        <w:t>{prolongation_clause}</w:t>
       </w:r>
     </w:p>
     <w:p>
@@ -202,7 +202,7 @@
         <w:jc w:val="both"/>
       </w:pPr>
       <w:r>
-        <w:t>3.1. Размер арендной платы по соглашению Сторон составляет: {rate_per_sqm} тенге за один квадратный метр в месяц, что составляет {monthly_rent_with_words} тенге в месяц. Арендная плата включает налог на добавленную стоимость (если применимо в соответствии с налоговым режимом Арендодателя).</w:t>
+        <w:t>{rent_clause}</w:t>
       </w:r>
     </w:p>
     <w:p>
@@ -258,7 +258,7 @@
         <w:jc w:val="both"/>
       </w:pPr>
       <w:r>
-        <w:t>3.5. Счёт-фактура и акт оказанных услуг за аренду выставляются Арендодателем не позднее 5 (пятого) числа каждого месяца. Невыставление счёта не освобождает Арендатора от обязанности своевременно вносить арендную плату.</w:t>
+        <w:t>{esf_clause}</w:t>
       </w:r>
     </w:p>
     <w:p>

</xml_diff>